<commit_message>
Investigacion precalificacion de leads (encaje + capacidad en la escalera) + respuesta a Jaider v2 con flujo nuevo, precio cuando lo piden, puntaje y Ley 2300
Co-Authored-By: Claude Fable 5.1 <noreply@anthropic.com>
</commit_message>
<xml_diff>
--- a/recursos/comercial/plataforma LaHaus/RESPUESTA_JAIDER_2026-10-13.docx
+++ b/recursos/comercial/plataforma LaHaus/RESPUESTA_JAIDER_2026-10-13.docx
@@ -12,7 +12,7 @@
           <w:color w:val="E54C09"/>
           <w:sz w:val="28"/>
         </w:rPr>
-        <w:t>RESPUESTA A JAIDER (LAHAUS) — 13/10/2026</w:t>
+        <w:t>RESPUESTA A JAIDER (LAHAUS) — 13/10/2026 (v2, con precalificación)</w:t>
       </w:r>
     </w:p>
     <w:p>
@@ -25,7 +25,7 @@
           <w:color w:val="666666"/>
           <w:sz w:val="19"/>
         </w:rPr>
-        <w:t>Responde a: Informe de respuestas al feedback del agente (16 puntos) + Informe de leads 29/09-08/10. Enviar por WhatsApp o correo; es un solo mensaje.</w:t>
+        <w:t>Responde a: Informe de respuestas al feedback (16 puntos) + Informe de leads 29/09-08/10. Base: INVESTIGACION_PRECALIFICACION_LEADS_2026-10-13.md §6. Enviar como un solo mensaje.</w:t>
       </w:r>
     </w:p>
     <w:p>
@@ -37,34 +37,62 @@
           <w:b w:val="0"/>
           <w:sz w:val="21"/>
         </w:rPr>
-        <w:t>Hola Jaider, gracias por los dos informes; están muy claros. Te respondo lo que quedó pendiente de nuestro lado y te dejo tres preguntas nuevas.</w:t>
+        <w:t>Hola Jaider, gracias por los dos informes; están muy claros. Te respondo lo pendiente de nuestro lado y te dejo preguntas nuevas.</w:t>
         <w:br/>
         <w:br/>
-        <w:t>1. ORDEN DE PERFILACIÓN Y PRECIOS (punto 1). Confirmado: el flujo queda así: (1) ¿para qué necesitas el inglés? → (2) ¿para ti o para alguien más? (edad solo si es menor) → (3) nivel → (4) jornada disponible → (5) ofrecer la cita. La pregunta de quién decide va DENTRO de la oferta de cita ("¿vienes solo o con la persona que decide contigo?"), no como paso aparte. Y sí: se eliminan los precios totales del agente. Si el lead pregunta precio, el agente responde que depende del programa y de la beca a la que aplique, y que eso se define en la asesoría personalizada de 20 minutos. El agente califica y agenda; no vende.</w:t>
+        <w:t>1. FLUJO DE PERFILACIÓN Y PRECIOS (punto 1). Decidido: el paso "programa y precio" se reemplaza por dos pasos de calificación, y la cita va al final. El flujo queda así (una pregunta por mensaje; si ya respondió, se salta):</w:t>
+        <w:br/>
+        <w:t xml:space="preserve">   1) MOTIVO (saludo vigente): "Hola, gracias por escribirnos. Soy el asistente de Heiiu. Para orientarte bien, ¿para qué necesitas el inglés?"</w:t>
+        <w:br/>
+        <w:t xml:space="preserve">   2) PARA QUIÉN: "¿El curso es para ti o para alguien más?" (si es para otro adulto: lo ideal es que esa persona hable directamente o venga a la asesoría).</w:t>
+        <w:br/>
+        <w:t xml:space="preserve">   3) NIVEL + EXPERIENCIA: "¿Hoy qué tanto inglés tienes? ¿Empiezas desde cero o ya estudiaste antes?" Si ya estudió: "¿Y qué pasó esa vez? ¿Por qué lo dejaste?"</w:t>
+        <w:br/>
+        <w:t xml:space="preserve">   4) PRESENCIAL + JORNADA: "Las clases son presenciales en Bucaramanga. ¿Qué jornada te queda mejor: mañana de 8:00 a 12:00 o noche de 6:30 a 8:30 PM?"</w:t>
+        <w:br/>
+        <w:t xml:space="preserve">   5) EL PACTO (nuevo): "Antes de agendarte te cuento cómo es, para que decidas con todo claro: esto es un entrenamiento. Todos los días grabas un video corto en inglés que tu profesor corrige, la puntualidad cuenta (tres llegadas tarde suman una falta) y en clase te corregimos en voz alta. A cambio, la garantía por escrito: si cumples y no avanzas, te devolvemos el 100% del nivel. ¿Te le mides a ese ritmo?"</w:t>
+        <w:br/>
+        <w:t xml:space="preserve">   6) FORMA DE PAGO (nuevo): "Para que la asesora te lleve el plan que te sirve: ¿cómo prefieres invertir: de contado (sirven cesantías, tarjeta o crédito de tu banco) o con una inicial y cuotas mensuales?" Si dice cuotas: "Los planes arrancan con una inicial desde $1.000.000 y cuotas mensuales según tu beca. ¿Algo así te cabe en el presupuesto?" Si dice "algo más bajo": "Tenemos opciones de entrada más cortas, como el Arranque A1+A2 o un nivel en los sábados. La asesora te muestra cuál te cuadra."</w:t>
+        <w:br/>
+        <w:t xml:space="preserve">   7) CITA + DECISOR: "Te agendo 20 a 30 minutos con la asesora para definir tu plan y tu beca: ¿[franja 1] o [franja 2]? Si alguien más decide contigo, me dices y lo incluimos." Confirmación: "Listo. Para que quede firme, escríbeme el día y la hora de tu asesoría tal como la anotaste." (también para las citas agendadas por voz; sin esa confirmación la cita queda "por confirmar").</w:t>
+        <w:br/>
+        <w:t xml:space="preserve">   Nunca se preguntan ingresos, salario, deudas ni reportes, y no se consultan centrales.</w:t>
+        <w:br/>
+        <w:t xml:space="preserve">   PRECIO: el agente no dice totales por iniciativa propia; la única cifra espontánea es la inicial "desde $1.000.000" en el paso 6. Si el lead PREGUNTA precio, se responde a la primera, una sola vez: "Te doy la referencia: el programa completo A1 a B2 es de $8.696.000 de lista y con la beca del Fondo (del 32% al 45% según tu perfil) baja bastante; se paga de contado o con una inicial desde $1.000.000 y cuotas mensuales. Si prefieres empezar más corto, el Arranque A1+A2 está en $2.990.000 de lanzamiento. Tu número exacto te lo da la asesora en 20 minutos: ¿[franja 1] o [franja 2]?"</w:t>
+        <w:br/>
+        <w:t xml:space="preserve">   DESPEDIDAS (mensaje final, sin reintentos después): "lo quiero gratis" -&gt; "Te entiendo. Nuestros programas tienen costo, con becas y cuotas, porque incluyen profesor, garantía y certificado. Si quieres, te aviso cuando abramos becas o entradas más cortas: ¿te escribo por aquí?" · rechaza el Pacto -&gt; "Te agradezco la sinceridad. Este programa es exigente a propósito y no te lo voy a vender si no es lo que buscas. Si más adelante quieres entrenar así, aquí estamos." · "no tengo el dinero ahora" (una sola vez) -&gt; "Hay opciones con inicial y cuotas, y con cesantías o crédito de tu banco. ¿Quieres que la asesora te muestre la más liviana, sin compromiso?"</w:t>
+        <w:br/>
+        <w:t xml:space="preserve">   PUNTAJE 0-10 que el agente marca en el panel (2/1/0 por criterio): presencial en la jornada · capacidad en la escalera · motivo con destino · disposición a la mentoría · quién decide. Caliente 8-10 (la asesora llama en menos de 5 min), tibio 5-7 (mismo día), frío 0-4 o con tope (no se agenda). Necesitamos los campos presencial_ok, pago_preferido, pacto_ok, motivo_destino, decisor, audio_recibido y el puntaje con su etiqueta; y que su definición actual de "lead caliente" se reemplace por esta.</w:t>
         <w:br/>
         <w:br/>
-        <w:t>2. SALUDOS POR CAMPAÑA (punto 7). Campañas activas: "Curso Inglés" sigue hasta el 15 de octubre y ese día se pausa. "Au Pair" está pausada desde el 8 de octubre. Desde el 15 de octubre entra una campaña nueva de WhatsApp con 8-9 anuncios; cada anuncio trae un mensaje prellenado con un código entre paréntesis (V1, V2… V9). El saludo debe ser uno solo, genérico, que reconozca ese mensaje y no mencione "Arranque de octubre" ni ningún programa: "Hola, gracias por escribirnos. Soy el asistente de Heiiu. Para orientarte bien, ¿para qué necesitas el inglés?". También desde el 15 entra un formulario nuevo (tipo mayor intención) cuyo lead llega ya escribiendo por el botón de WhatsApp; mismo saludo.</w:t>
+        <w:t>2. SALUDOS POR CAMPAÑA (punto 7). "Curso Inglés" sigue hasta el 15 de octubre y ese día se pausa. "Au Pair" está pausada desde el 8. Desde el 15 entra una campaña nueva de WhatsApp con 8-9 anuncios; cada uno trae un mensaje prellenado con un código entre paréntesis (V1 a V9). El saludo es uno solo, genérico, que reconoce ese mensaje y no menciona "Arranque de octubre" ni programas (el del paso 1). También desde el 15 entra un formulario nuevo (mayor intención) cuyo lead llega escribiendo por el botón de WhatsApp; mismo saludo.</w:t>
         <w:br/>
         <w:br/>
-        <w:t>3. CASOS DE LOS PUNTOS 9, 10 Y 15. Los casos están en el panel con nombre y fecha: Henry (6/10, 8:16 pm: precios $9.560.000 y $3.150.000, que no existen), lead del 7/10 que dijo "quiero reforzar lo que ya sé" (pregunta repetida), María Eugenia (7/10, 12:34 pm: el agente siguió después de "déjame que la asesora te escriba"), Jerson (6/10: pausado 10:11, activo 10:46) y la llamada sin perfilar del punto 15. Si para buscarlos necesitan sí o sí el número, los sacamos y te los mandamos hoy; dinos de dónde los toman ustedes para no duplicar.</w:t>
+        <w:t>3. CASOS DE LOS PUNTOS 9, 10 Y 15. Están en el panel por nombre y fecha: Henry (6/10, 8:16 pm: precios $9.560.000 y $3.150.000, que no existen), lead del 7/10 "quiero reforzar lo que ya sé" (pregunta repetida), María Eugenia (7/10, 12:34 pm: el agente siguió después de "déjame que la asesora te escriba"), Jerson (6/10: pausado 10:11, activo 10:46) y la llamada sin perfilar del punto 15. Si necesitan el número sí o sí, lo sacamos hoy; dinos de dónde lo toman ustedes para no duplicar.</w:t>
         <w:br/>
         <w:br/>
-        <w:t>Tres preguntas nuevas, con el informe de leads en la mano:</w:t>
+        <w:t>Preguntas nuevas:</w:t>
         <w:br/>
         <w:br/>
-        <w:t>4. ENTREGA DEL PRIMER MENSAJE. A los leads de pauta les llega el primer mensaje en el 80,4% de los casos, contra 91,2% en la base reactivada. Es la brecha más cara que tenemos: ¿cuál es la causa (plantilla, ventana de 24 horas, número no válido, calidad del número) y qué proponen para cerrarla antes del 15?</w:t>
+        <w:t>4. ENTREGA DEL PRIMER MENSAJE. A los leads de pauta les llega el primer mensaje en el 80,4% de los casos, contra 91,2% en la base reactivada. ¿Cuál es la causa (plantilla, ventana de 24 horas, número no válido) y qué proponen para cerrarla antes del 15?</w:t>
         <w:br/>
         <w:br/>
-        <w:t>5. IDENTIFICADOR DEL ANUNCIO. Para medir qué video trae cada cita sin depender del código: (a) ¿guardan el identificador del anuncio (ctwa_clid / source_id) que llega en el primer mensaje de cada conversación? (b) ¿envían a Meta el evento de "cliente potencial" por la API de conversiones de mensajería? Si (a) es sí, ¿pueden exportar las citas con el anuncio de origen?</w:t>
+        <w:t>5. IDENTIFICADOR DEL ANUNCIO. (a) ¿Guardan el identificador del anuncio (ctwa_clid / source_id) que llega en el primer mensaje? (b) ¿Envían a Meta el evento de "cliente potencial" por la API de conversiones de mensajería? Si (a) es sí, ¿pueden exportar las citas con el anuncio de origen?</w:t>
         <w:br/>
         <w:br/>
-        <w:t>6. REACTIVACIÓN (BLAST). El del 6 de octubre metió 489 leads y produjo 2 citas; un lead de pauta responde 4,2 veces más y agenda 3,7 veces más. Hasta nuevo aviso no se hacen reactivaciones sin aprobación por escrito de gerencia, y necesito que me confirmen cómo se factura ese blast (si cada lead reactivado cuenta como lead facturable).</w:t>
+        <w:t>6. AUDIOS. ¿El agente recibe notas de voz, las transcribe y las deja en el panel? Si sí, agregamos un paso opcional de audio de 30 segundos antes de la cita.</w:t>
         <w:br/>
         <w:br/>
-        <w:t>Lo demás (plantillas de nombre y correo, recordatorios a 12 h y 1 h, "fecha de cohorte") quedó bien. Lo que la plataforma no permite (reintentos distintos, aviso a humano por disparadores, agrupar mensajes, validar nombre) lo entendemos y lo compensamos del lado nuestro con la llamada en los primeros 5 minutos.</w:t>
+        <w:t>7. HORARIO LEGAL (Ley 2300 de 2023). Mensajes y llamadas comerciales solo de lunes a viernes 7:00 a.m.-7:00 p.m. y sábados 8:00 a.m.-3:00 p.m., nunca domingos ni festivos. ¿Cómo lo tienen configurado y cuántos contactos por día hace hoy el agente por lead? La cadencia actual la está revisando nuestro abogado.</w:t>
         <w:br/>
         <w:br/>
-        <w:t>Revisamos números el 15 con la campaña nueva al aire. Gracias.</w:t>
+        <w:t>8. REACTIVACIÓN (BLAST). El del 6 de octubre metió 489 leads y produjo 2 citas; un lead de pauta responde 4,2 veces más y agenda 3,7 veces más. Hasta nuevo aviso no se hacen reactivaciones sin aprobación por escrito de gerencia, y necesito que confirmen cómo se factura ese blast.</w:t>
+        <w:br/>
+        <w:br/>
+        <w:t>9. INFORME SEMANAL por etiqueta (caliente/tibio/frío): leads, citas, asistencia y matrícula (ese dato lo pasa la asesora). Corte de evaluación: 31 de octubre.</w:t>
+        <w:br/>
+        <w:br/>
+        <w:t>Lo demás (plantillas de nombre y correo, recordatorios a 12 h y 1 h, "fecha de cohorte") quedó bien. Lo que la plataforma no permite lo compensamos con la llamada en los primeros 5 minutos. Revisamos números el 15 con la campaña nueva al aire. Gracias.</w:t>
       </w:r>
     </w:p>
     <w:sectPr>

</xml_diff>

<commit_message>
Instrucciones Brian: 7 secciones, Au Pair prioridad, sin reglas de video ni protocolo LaHaus; respuesta Jaider final con cadencia Ley 2300 y A/B
Co-Authored-By: Claude Fable 5.1 <noreply@anthropic.com>
</commit_message>
<xml_diff>
--- a/recursos/comercial/plataforma LaHaus/RESPUESTA_JAIDER_2026-10-13.docx
+++ b/recursos/comercial/plataforma LaHaus/RESPUESTA_JAIDER_2026-10-13.docx
@@ -83,13 +83,13 @@
         <w:t>6. AUDIOS. ¿El agente recibe notas de voz, las transcribe y las deja en el panel? Si sí, agregamos un paso opcional de audio de 30 segundos antes de la cita.</w:t>
         <w:br/>
         <w:br/>
-        <w:t>7. HORARIO LEGAL (Ley 2300 de 2023). Mensajes y llamadas comerciales solo de lunes a viernes 7:00 a.m.-7:00 p.m. y sábados 8:00 a.m.-3:00 p.m., nunca domingos ni festivos. ¿Cómo lo tienen configurado y cuántos contactos por día hace hoy el agente por lead? La cadencia actual la está revisando nuestro abogado.</w:t>
+        <w:t>7. CADENCIA Y HORARIO (Ley 2300 de 2023). Mensajes y llamadas comerciales solo de lunes a viernes 7:00 a.m.-7:00 p.m. y sábados 8:00 a.m.-3:00 p.m., nunca domingos ni festivos; y no más de un contacto al día por iniciativa de la empresa. Pedimos: (a) apagar las llamadas de voz de la IA en frío (505 llamadas en el último informe dieron 2 citas y las 2 faltaron); (b) que nada salga por iniciativa del agente (reintentos, plantillas, llamadas, blasts) fuera de ese horario: fuera de horario el agente solo responde lo que el lead escriba; (c) máximo 1 contacto por iniciativa nuestra al día por lead: día 0, día 1, día 3 y día 7 (despedida y silencio); (d) recordatorios de cita a las 6:30 p.m. del día anterior y 1 hora antes solo si cae en horario legal, y quitar la anticipación mínima de 24 h para agendar; (e) aviso inmediato a la asesora con cinco disparadores: pide una persona, segunda pregunta de precio o pregunta por la mensualidad, dice "no por ahora / lo pienso", es familia o ruta ejecutiva, o se queda callado 15 minutos después de dar el motivo sin agendar; (f) el primer contacto humano será una "llamada anunciada" por la misma línea de WhatsApp ("¿te llamo ahora 5 minutos? te marco desde el 3xx…"): ¿pueden habilitar llamadas de WhatsApp desde la línea de Heiiu? La cadencia completa la está revisando nuestro abogado; esto es lo que ya no admite discusión.</w:t>
         <w:br/>
         <w:br/>
         <w:t>8. REACTIVACIÓN (BLAST). El del 6 de octubre metió 489 leads y produjo 2 citas; un lead de pauta responde 4,2 veces más y agenda 3,7 veces más. Hasta nuevo aviso no se hacen reactivaciones sin aprobación por escrito de gerencia, y necesito que confirmen cómo se factura ese blast.</w:t>
         <w:br/>
         <w:br/>
-        <w:t>9. INFORME SEMANAL por etiqueta (caliente/tibio/frío): leads, citas, asistencia y matrícula (ese dato lo pasa la asesora). Corte de evaluación: 31 de octubre.</w:t>
+        <w:t>9. INFORME SEMANAL por etiqueta (caliente/tibio/frío) y por grupo A/B (último dígito del teléfono: par = solo bot, impar = bot + llamada anunciada): leads, citas, asistencia y matrícula (ese dato lo pasa la asesora). Y los envíos fallidos del primer mensaje a leads de pauta por código de error (131049, 131026) y por origen (formulario vs. clic a WhatsApp). Corte de evaluación: 31 de octubre.</w:t>
         <w:br/>
         <w:br/>
         <w:t>Lo demás (plantillas de nombre y correo, recordatorios a 12 h y 1 h, "fecha de cohorte") quedó bien. Lo que la plataforma no permite lo compensamos con la llamada en los primeros 5 minutos. Revisamos números el 15 con la campaña nueva al aire. Gracias.</w:t>

</xml_diff>

<commit_message>
Respuesta a Jaider v3 final: Pacto v3, inicial 20%, precio 'pero mas que el dinero', despedidas depuradas, anuncios el 14
Co-Authored-By: Claude Fable 5.1 <noreply@anthropic.com>
</commit_message>
<xml_diff>
--- a/recursos/comercial/plataforma LaHaus/RESPUESTA_JAIDER_2026-10-13.docx
+++ b/recursos/comercial/plataforma LaHaus/RESPUESTA_JAIDER_2026-10-13.docx
@@ -12,7 +12,7 @@
           <w:color w:val="E54C09"/>
           <w:sz w:val="28"/>
         </w:rPr>
-        <w:t>RESPUESTA A JAIDER (LAHAUS) — 13/10/2026 (v2, con precalificación)</w:t>
+        <w:t>RESPUESTA A JAIDER (LAHAUS) — 13/10/2026 (v3 final, con precalificación)</w:t>
       </w:r>
     </w:p>
     <w:p>
@@ -50,31 +50,37 @@
         <w:br/>
         <w:t xml:space="preserve">   4) PRESENCIAL + JORNADA: "Las clases son presenciales en Bucaramanga. ¿Qué jornada te queda mejor: mañana de 8:00 a 12:00 o noche de 6:30 a 8:30 PM?"</w:t>
         <w:br/>
-        <w:t xml:space="preserve">   5) EL PACTO (nuevo): "Antes de agendarte te cuento cómo es, para que decidas con todo claro: esto es un entrenamiento. Todos los días grabas un video corto en inglés que tu profesor corrige, la puntualidad cuenta (tres llegadas tarde suman una falta) y en clase te corregimos en voz alta. A cambio, la garantía por escrito: si cumples y no avanzas, te devolvemos el 100% del nivel. ¿Te le mides a ese ritmo?"</w:t>
+        <w:t xml:space="preserve">   5) EL PACTO (nuevo): "Antes de agendarte te cuento cómo es, para que decidas con todo claro. Nuestro objetivo es que salgas hablando inglés; si no se logra, algo está mal: o tú dejaste de entrenar, o nosotros no estamos cumpliendo. Esto es un entrenamiento en equipo, como un gimnasio o aprender a nadar: desde el primer día hablas, tu profesor identifica dónde puedes mejorar y lo repetimos hasta que sale. Por eso grabas un video corto todos los días, y tu profesor te lo devuelve con una mejora. A cambio, la garantía por escrito: si cumples tu parte y no avanzas, te devolvemos el 100% del nivel. ¿Te le mides a ese ritmo?" Si duda ("¿todos los días?"): "Son unos minutos al día, y tu profesor te responde cada uno. Es la parte que más te hace avanzar. ¿Te le mides?"</w:t>
         <w:br/>
-        <w:t xml:space="preserve">   6) FORMA DE PAGO (nuevo): "Para que la asesora te lleve el plan que te sirve: ¿cómo prefieres invertir: de contado (sirven cesantías, tarjeta o crédito de tu banco) o con una inicial y cuotas mensuales?" Si dice cuotas: "Los planes arrancan con una inicial desde $1.000.000 y cuotas mensuales según tu beca. ¿Algo así te cabe en el presupuesto?" Si dice "algo más bajo": "Tenemos opciones de entrada más cortas, como el Arranque A1+A2 o un nivel en los sábados. La asesora te muestra cuál te cuadra."</w:t>
+        <w:t xml:space="preserve">   6) FORMA DE PAGO (nuevo): "Para que la asesora te lleve el plan que te sirve: ¿cómo prefieres invertir: de contado (sirven cesantías, tarjeta o crédito de tu banco) o con una inicial y cuotas mensuales?" Si dice cuotas: "Los planes arrancan con una inicial del 20% y cuotas mensuales según tu beca. ¿Algo así te cabe en el presupuesto?" Si dice "algo más bajo" o "no sé si me alcanza": "Tenemos una opción de entrada en $2.990.000 (el Arranque A1+A2) y niveles sueltos los sábados. La asesora te muestra cuál te cuadra."</w:t>
         <w:br/>
         <w:t xml:space="preserve">   7) CITA + DECISOR: "Te agendo 20 a 30 minutos con la asesora para definir tu plan y tu beca: ¿[franja 1] o [franja 2]? Si alguien más decide contigo, me dices y lo incluimos." Confirmación: "Listo. Para que quede firme, escríbeme el día y la hora de tu asesoría tal como la anotaste." (también para las citas agendadas por voz; sin esa confirmación la cita queda "por confirmar").</w:t>
         <w:br/>
-        <w:t xml:space="preserve">   Nunca se preguntan ingresos, salario, deudas ni reportes, y no se consultan centrales.</w:t>
+        <w:t xml:space="preserve">   Nunca se preguntan ingresos, salario, deudas ni reportes, y no se consultan centrales. El agente no dice ningún valor de cuota.</w:t>
         <w:br/>
-        <w:t xml:space="preserve">   PRECIO: el agente no dice totales por iniciativa propia; la única cifra espontánea es la inicial "desde $1.000.000" en el paso 6. Si el lead PREGUNTA precio, se responde a la primera, una sola vez: "Te doy la referencia: el programa completo A1 a B2 es de $8.696.000 de lista y con la beca del Fondo (del 32% al 45% según tu perfil) baja bastante; se paga de contado o con una inicial desde $1.000.000 y cuotas mensuales. Si prefieres empezar más corto, el Arranque A1+A2 está en $2.990.000 de lanzamiento. Tu número exacto te lo da la asesora en 20 minutos: ¿[franja 1] o [franja 2]?"</w:t>
+        <w:t xml:space="preserve">   PRECIO: el agente no dice totales por iniciativa propia. Si el lead PREGUNTA precio, se responde a la primera, una sola vez: "Te doy la referencia: el programa completo A1 a B2 es de $8.696.000 de lista, y con la beca del Fondo (hasta el 45% según tu perfil) baja bastante. Se paga de contado o con una inicial del 20% y cuotas mensuales. Pero más que el dinero, que lo cuadramos, lo que buscamos es que estés dispuesto a entrenarte con nosotros. Tu número exacto te lo da la asesora en 20 minutos: ¿[franja 1] o [franja 2]?" Si pregunta precio por segunda vez, no se repiten cifras: "Eso depende de tu beca y de cómo quieras pagar; la asesora te lo cierra en la cita" y se ofrecen las franjas.</w:t>
         <w:br/>
-        <w:t xml:space="preserve">   DESPEDIDAS (mensaje final, sin reintentos después): "lo quiero gratis" -&gt; "Te entiendo. Nuestros programas tienen costo, con becas y cuotas, porque incluyen profesor, garantía y certificado. Si quieres, te aviso cuando abramos becas o entradas más cortas: ¿te escribo por aquí?" · rechaza el Pacto -&gt; "Te agradezco la sinceridad. Este programa es exigente a propósito y no te lo voy a vender si no es lo que buscas. Si más adelante quieres entrenar así, aquí estamos." · "no tengo el dinero ahora" (una sola vez) -&gt; "Hay opciones con inicial y cuotas, y con cesantías o crédito de tu banco. ¿Quieres que la asesora te muestre la más liviana, sin compromiso?"</w:t>
+        <w:t xml:space="preserve">   DESPEDIDAS (mensaje final, sin reintentos después; el lead queda marcado "frío" y la asesora decide si lo llama):</w:t>
         <w:br/>
-        <w:t xml:space="preserve">   PUNTAJE 0-10 que el agente marca en el panel (2/1/0 por criterio): presencial en la jornada · capacidad en la escalera · motivo con destino · disposición a la mentoría · quién decide. Caliente 8-10 (la asesora llama en menos de 5 min), tibio 5-7 (mismo día), frío 0-4 o con tope (no se agenda). Necesitamos los campos presencial_ok, pago_preferido, pacto_ok, motivo_destino, decisor, audio_recibido y el puntaje con su etiqueta; y que su definición actual de "lead caliente" se reemplace por esta.</w:t>
+        <w:t xml:space="preserve">   - "No tengo el dinero ahora" (una sola vez): "Hay opciones con inicial y cuotas, y con cesantías o crédito de tu banco. ¿Quieres que la asesora te muestre cómo puedes entrenarte con nosotros con menos esfuerzo económico?" Sí → cita (tibio). No → "Perfecto. Cuando sea tu momento, me escribes por aquí y te agendo."</w:t>
+        <w:br/>
+        <w:t xml:space="preserve">   - "Solo si es gratis": "Te entiendo. Nuestros programas tienen costo, con becas y cuotas, porque incluyen profesor, garantía y certificado. Si quieres, te aviso cuando abramos becas o entradas más cortas: ¿te escribo por aquí?" (solo con su sí se guarda para campañas).</w:t>
+        <w:br/>
+        <w:t xml:space="preserve">   - Rechaza el Pacto ("busco algo más suave"): "Te agradezco la sinceridad. Este programa es exigente a propósito, y prefiero decírtelo ahora a que lo descubras en la segunda semana. Si más adelante quieres entrenarte con propósito, ¡escríbenos!"</w:t>
+        <w:br/>
+        <w:t xml:space="preserve">   PUNTAJE 0-10 que el agente marca en el panel (2/1/0 por criterio): presencial en la jornada · capacidad en la escalera · motivo con destino · disposición a la mentoría · quién decide. Caliente 8-10 (la asesora le escribe en menos de 15 minutos y lo llama con su permiso), tibio 5-7 (mismo día), frío 0-4 o con tope (no se agenda). Necesitamos los campos presencial_ok, pago_preferido, pacto_ok, motivo_destino, decisor, audio_recibido y el puntaje con su etiqueta; y que su definición actual de "lead caliente" se reemplace por esta.</w:t>
         <w:br/>
         <w:br/>
-        <w:t>2. SALUDOS POR CAMPAÑA (punto 7). "Curso Inglés" sigue hasta el 15 de octubre y ese día se pausa. "Au Pair" está pausada desde el 8. Desde el 15 entra una campaña nueva de WhatsApp con 8-9 anuncios; cada uno trae un mensaje prellenado con un código entre paréntesis (V1 a V9). El saludo es uno solo, genérico, que reconoce ese mensaje y no menciona "Arranque de octubre" ni programas (el del paso 1). También desde el 15 entra un formulario nuevo (mayor intención) cuyo lead llega escribiendo por el botón de WhatsApp; mismo saludo.</w:t>
+        <w:t>2. SALUDOS POR CAMPAÑA (punto 7). "Au Pair" está pausada desde el 8. "Curso Inglés" como formulario se pausó el 13 y ese anuncio pasó a WhatsApp ese mismo día. Mañana 14 entran en esa campaña 3 anuncios nuevos, cada uno con un mensaje prellenado que trae un código entre paréntesis (V1, V3 y V4; los demás, V2 y V5 a V9, entran el 22). Les compartimos el enlace apenas estén montados. El saludo es uno solo, genérico, que reconoce ese mensaje y no menciona "Arranque de octubre" ni programas: el del paso 1. También desde el 14 entra un formulario nuevo (mayor intención) cuyo lead llega escribiendo por el botón de WhatsApp; mismo saludo.</w:t>
         <w:br/>
         <w:br/>
-        <w:t>3. CASOS DE LOS PUNTOS 9, 10 Y 15. Están en el panel por nombre y fecha: Henry (6/10, 8:16 pm: precios $9.560.000 y $3.150.000, que no existen), lead del 7/10 "quiero reforzar lo que ya sé" (pregunta repetida), María Eugenia (7/10, 12:34 pm: el agente siguió después de "déjame que la asesora te escriba"), Jerson (6/10: pausado 10:11, activo 10:46) y la llamada sin perfilar del punto 15. Si necesitan el número sí o sí, lo sacamos hoy; dinos de dónde lo toman ustedes para no duplicar.</w:t>
+        <w:t>3. CASOS DE LOS PUNTOS 9, 10 Y 15. Están en el panel por nombre y fecha: Henry (6/10, 8:16 pm: precios $9.560.000 y $3.150.000, que no existen), lead del 7/10 "quiero reforzar lo que ya sé" (pregunta repetida), María Eugenia (7/10, 12:34 pm: el agente siguió después de "déjame que la asesora te escriba"), Jerson (6/10: pausado 10:11, activo 10:46) y la llamada sin perfilar del punto 15. Si necesitan el número sí o sí, lo sacamos; dinos de dónde lo toman ustedes para no duplicar.</w:t>
         <w:br/>
         <w:br/>
         <w:t>Preguntas nuevas:</w:t>
         <w:br/>
         <w:br/>
-        <w:t>4. ENTREGA DEL PRIMER MENSAJE. A los leads de pauta les llega el primer mensaje en el 80,4% de los casos, contra 91,2% en la base reactivada. ¿Cuál es la causa (plantilla, ventana de 24 horas, número no válido) y qué proponen para cerrarla antes del 15?</w:t>
+        <w:t>4. ENTREGA DEL PRIMER MENSAJE. A los leads de pauta les llega el primer mensaje en el 80,4% de los casos, contra 91,2% en la base reactivada. ¿Cuál es la causa (plantilla, ventana de 24 horas, número no válido) y qué proponen para cerrarla esta semana?</w:t>
         <w:br/>
         <w:br/>
         <w:t>5. IDENTIFICADOR DEL ANUNCIO. (a) ¿Guardan el identificador del anuncio (ctwa_clid / source_id) que llega en el primer mensaje? (b) ¿Envían a Meta el evento de "cliente potencial" por la API de conversiones de mensajería? Si (a) es sí, ¿pueden exportar las citas con el anuncio de origen?</w:t>
@@ -92,7 +98,7 @@
         <w:t>9. INFORME SEMANAL por etiqueta (caliente/tibio/frío) y por grupo A/B (último dígito del teléfono: par = solo bot, impar = bot + llamada anunciada): leads, citas, asistencia y matrícula (ese dato lo pasa la asesora). Y los envíos fallidos del primer mensaje a leads de pauta por código de error (131049, 131026) y por origen (formulario vs. clic a WhatsApp). Corte de evaluación: 31 de octubre.</w:t>
         <w:br/>
         <w:br/>
-        <w:t>Lo demás (plantillas de nombre y correo, recordatorios a 12 h y 1 h, "fecha de cohorte") quedó bien. Lo que la plataforma no permite lo compensamos con la llamada en los primeros 5 minutos. Revisamos números el 15 con la campaña nueva al aire. Gracias.</w:t>
+        <w:t>Lo demás (plantillas de nombre y correo, recordatorios a 12 h y 1 h, "fecha de cohorte") quedó bien. Lo que la plataforma no permite lo compensamos con la llamada anunciada de la asesora. Revisamos números el 15 con los anuncios nuevos al aire. Gracias.</w:t>
       </w:r>
     </w:p>
     <w:sectPr>

</xml_diff>

<commit_message>
Respuesta Jaider: casos en vinetas con el numero disponible
Co-Authored-By: Claude Fable 5.1 <noreply@anthropic.com>
</commit_message>
<xml_diff>
--- a/recursos/comercial/plataforma LaHaus/RESPUESTA_JAIDER_2026-10-13.docx
+++ b/recursos/comercial/plataforma LaHaus/RESPUESTA_JAIDER_2026-10-13.docx
@@ -74,7 +74,19 @@
         <w:t>2. SALUDOS POR CAMPAÑA (punto 7). Desde ahora el saludo es UNO SOLO, genérico, para todos los anuncios presentes y futuros: el del paso 1. Lo que identifica cada anuncio no es el saludo sino el CÓDIGO que viene entre paréntesis en el mensaje prellenado del botón de WhatsApp (V1, V2… V9); el agente lo lee y sigue el flujo normal. Así ya no hay que cambiar saludos por campaña: Au Pair, cuando vuelva, entra como el anuncio V5 con su código y el bot lo reconoce igual. Solo les avisaríamos si algún día se crea una campaña nueva aparte. Estado hoy: "Au Pair" pausada desde el 8; "Curso Inglés" como formulario se pausó el 13 y ese anuncio pasó a WhatsApp ese mismo día; mañana 14 entran en esa campaña los anuncios V1, V3 y V4 (los demás, el 22) y les compartimos el enlace apenas estén montados. También desde el 14 entra un formulario nuevo (mayor intención) cuyo lead llega escribiendo por el botón de WhatsApp; mismo saludo.</w:t>
         <w:br/>
         <w:br/>
-        <w:t>3. CASOS DE LOS PUNTOS 9, 10 Y 15. Están en el panel por nombre y fecha: Henry (6/10, 8:16 pm: precios $9.560.000 y $3.150.000, que no existen), lead del 7/10 "quiero reforzar lo que ya sé" (pregunta repetida), María Eugenia (7/10, 12:34 pm: el agente siguió después de "déjame que la asesora te escriba"), Jerson (6/10: pausado 10:11, activo 10:46) y la llamada sin perfilar del punto 15. Si necesitan el número sí o sí, lo sacamos; dinos de dónde lo toman ustedes para no duplicar.</w:t>
+        <w:t>3. CASOS DE LOS PUNTOS 9, 10 Y 15. Los que tenemos:</w:t>
+        <w:br/>
+        <w:t xml:space="preserve">   • Jerson (6/10): pausado a las 10:11 y el agente volvió a escribirle a las 10:46. Número: 317 376 1839.</w:t>
+        <w:br/>
+        <w:t xml:space="preserve">   • Henry (6/10, 8:16 pm): el agente le dio $9.560.000 y $3.150.000, que no existen. No lo tenemos en rescates; búsquenlo por nombre y hora en el panel.</w:t>
+        <w:br/>
+        <w:t xml:space="preserve">   • Lead del 7/10 que dijo "quiero reforzar lo que ya sé" y el agente le repitió la pregunta: no tenemos el número; búsquenlo por fecha y frase.</w:t>
+        <w:br/>
+        <w:t xml:space="preserve">   • María Eugenia (7/10, 12:34 pm): el agente siguió escribiendo después de "déjame que la asesora te escriba". No tenemos el número; búsquenlo por nombre y hora.</w:t>
+        <w:br/>
+        <w:t xml:space="preserve">   • La llamada sin perfilar del punto 15: ustedes tienen el registro de la llamada.</w:t>
+        <w:br/>
+        <w:t xml:space="preserve">   Si alguno no aparece, dinos qué dato necesitan y lo sacamos.</w:t>
         <w:br/>
         <w:br/>
         <w:t>Preguntas nuevas:</w:t>

</xml_diff>

<commit_message>
Respuesta Jaider: ediciones de Diana (casos, audio) + punto 7 con velocidad a cualquier hora para quien escribe y ley para lo demas
Co-Authored-By: Claude Fable 5.1 <noreply@anthropic.com>
</commit_message>
<xml_diff>
--- a/recursos/comercial/plataforma LaHaus/RESPUESTA_JAIDER_2026-10-13.docx
+++ b/recursos/comercial/plataforma LaHaus/RESPUESTA_JAIDER_2026-10-13.docx
@@ -78,11 +78,11 @@
         <w:br/>
         <w:t xml:space="preserve">   • Jerson (6/10): pausado a las 10:11 y el agente volvió a escribirle a las 10:46. Número: 317 376 1839.</w:t>
         <w:br/>
-        <w:t xml:space="preserve">   • Henry (6/10, 8:16 pm): el agente le dio $9.560.000 y $3.150.000, que no existen. No lo tenemos en rescates; búsquenlo por nombre y hora en el panel.</w:t>
+        <w:t xml:space="preserve">   • Henry (6/10, 8:16 pm): el agente le dio $9.560.000 y $3.150.000, que no existen. No lo tenemos en rescates; por favor búsquenlo en sus datos: yo intenté a las 11:30 y me aparece que las conversaciones no están disponibles.</w:t>
         <w:br/>
-        <w:t xml:space="preserve">   • Lead del 7/10 que dijo "quiero reforzar lo que ya sé" y el agente le repitió la pregunta: no tenemos el número ni el nombre, y en nuestro panel solo se busca por nombre, teléfono o correo. Ustedes tienen el texto de las conversaciones: búsquenlo del lado de ustedes por fecha (7/10) y frase.</w:t>
+        <w:t xml:space="preserve">   • Lead del 7/10 que dijo "quiero reforzar lo que ya sé" y el agente le repitió la pregunta: no tenemos el número ni el nombre, y en nuestro panel solo se busca por nombre, teléfono o correo. Ustedes tienen el texto de las conversaciones: por favor búsquenlo del lado de ustedes por fecha (7/10) y frase.</w:t>
         <w:br/>
-        <w:t xml:space="preserve">   • María Eugenia (7/10, 12:34 pm): el agente siguió escribiendo después de "déjame que la asesora te escriba". No tenemos el número; búsquenlo por nombre y hora.</w:t>
+        <w:t xml:space="preserve">   • María Eugenia (7/10, 12:34 pm): el agente siguió escribiendo después de "déjame que la asesora te escriba". No tenemos el número; por favor búsquenlo por nombre y hora.</w:t>
         <w:br/>
         <w:t xml:space="preserve">   • La llamada sin perfilar del punto 15: ustedes tienen el registro de la llamada.</w:t>
         <w:br/>
@@ -98,10 +98,10 @@
         <w:t>5. IDENTIFICADOR DEL ANUNCIO. (a) ¿Guardan el identificador del anuncio (ctwa_clid / source_id) que llega en el primer mensaje? (b) ¿Envían a Meta el evento de "cliente potencial" por la API de conversiones de mensajería? Si (a) es sí, ¿pueden exportar las citas con el anuncio de origen?</w:t>
         <w:br/>
         <w:br/>
-        <w:t>6. AUDIOS (ya nos confirmaron que el agente los recibe y los transcribe; imágenes y videos no). Entonces agregamos un paso OPCIONAL entre la forma de pago y la cita: "Última cosa, y es opcional: mándame un audio de 30 segundos contándome por qué quieres el inglés, en inglés o en español, como te salga. La asesora lo escucha antes de tu cita." El audio recibido marca el campo audio_recibido y suma en el criterio de disposición a la mentoría; la transcripción debe quedar en el panel para que la asesora la lea antes de llamar. Si el lead manda una imagen o un video, el agente responde: "Por aquí no puedo ver imágenes ni videos; cuéntame por escrito o en un audio y seguimos."</w:t>
+        <w:t>6. AUDIOS. Por favor agreguemos un paso OPCIONAL entre la forma de pago y la cita: "Última cosa, y es opcional: mándame un audio de 30 segundos contándome por qué quieres el inglés, en inglés o en español, como te salga. La asesora lo escucha antes de tu cita." El audio recibido marca el campo audio_recibido y suma en el criterio de disposición a la mentoría; la transcripción debe quedar en el panel para que la asesora la lea antes de llamar. Si el lead manda una imagen o un video, el agente responde: "Por aquí no puedo ver imágenes ni videos; cuéntame por escrito o en un audio y seguimos."</w:t>
         <w:br/>
         <w:br/>
-        <w:t>7. CADENCIA Y HORARIO (Ley 2300 de 2023). Mensajes y llamadas comerciales solo de lunes a viernes 7:00 a.m.-7:00 p.m. y sábados 8:00 a.m.-3:00 p.m., nunca domingos ni festivos; y no más de un contacto al día por iniciativa de la empresa. Pedimos: (a) apagar las llamadas de voz de la IA en frío (505 llamadas en el último informe dieron 2 citas y las 2 faltaron); (b) que nada salga por iniciativa del agente (reintentos, plantillas, llamadas, blasts) fuera de ese horario: fuera de horario el agente solo responde lo que el lead escriba; (c) máximo 1 contacto por iniciativa nuestra al día por lead: día 0, día 1, día 3 y día 7 (despedida y silencio); (d) recordatorios de cita a las 6:30 p.m. del día anterior y 1 hora antes solo si cae en horario legal, y quitar la anticipación mínima de 24 h para agendar; (e) aviso inmediato a la asesora con cinco disparadores: pide una persona, segunda pregunta de precio o pregunta por la mensualidad, dice "no por ahora / lo pienso", es familia o ruta ejecutiva, o se queda callado 15 minutos después de dar el motivo sin agendar; (f) el primer contacto humano será una "llamada anunciada" por la misma línea de WhatsApp ("¿te llamo ahora 5 minutos? te marco desde el 3xx…"): ¿pueden habilitar llamadas de WhatsApp desde la línea de Heiiu? La cadencia completa la está revisando nuestro abogado; esto es lo que ya no admite discusión.</w:t>
+        <w:t>7. CADENCIA Y HORARIO (Ley 2300 de 2023). Primero la velocidad: el lead que escribe recibe respuesta del agente en segundos, a CUALQUIER hora, incluidos noches, domingos y festivos, y puede agendar ahí mismo (responder a quien nos escribe es información solicitada, no contacto comercial). El lead de FORMULARIO recibe primero la llamada y después el mensaje, dentro de los primeros 5 minutos, si entra en horario legal; si entra fuera de horario, recibe el mensaje de inmediato y la llamada a primera hora del siguiente día hábil. Después de ese primer contacto, los siguientes respetan la ley: mensajes y llamadas por iniciativa nuestra solo de lunes a viernes 7:00 a.m.-7:00 p.m. y sábados 8:00 a.m.-3:00 p.m., nunca domingos ni festivos, y no más de un contacto al día. Pedimos: (a) apagar las llamadas de voz de la IA en frío (505 llamadas en el último informe dieron 2 citas y las 2 faltaron); (b) reintentos, plantillas y blasts solo en horario legal; (c) máximo 1 contacto por iniciativa nuestra al día por lead: día 0, día 1, día 3 y día 7 (despedida y silencio); (d) recordatorios de cita a las 6:30 p.m. del día anterior y 1 hora antes solo si cae en horario legal, y quitar la anticipación mínima de 24 h para agendar; (e) aviso inmediato a la asesora con cinco disparadores: pide una persona, segunda pregunta de precio o pregunta por la mensualidad, dice "no por ahora / lo pienso", es familia o ruta ejecutiva, o se queda callado 15 minutos después de dar el motivo sin agendar; (f) el primer contacto humano con el lead de WhatsApp será una "llamada anunciada" por la misma línea ("¿te llamo ahora 5 minutos? te marco desde el 3xx…"): ¿pueden habilitar llamadas de WhatsApp desde la línea de Heiiu? La cadencia completa la está revisando nuestro abogado; esto es lo que ya no admite discusión.</w:t>
         <w:br/>
         <w:br/>
         <w:t>8. REACTIVACIÓN (BLAST). El del 6 de octubre metió 489 leads y produjo 2 citas; un lead de pauta responde 4,2 veces más y agenda 3,7 veces más. Hasta nuevo aviso no se hacen reactivaciones sin aprobación por escrito de gerencia, y necesito que confirmen cómo se factura ese blast.</w:t>

</xml_diff>

<commit_message>
Respuesta Jaider: llamadas desde la plataforma (grabadas y transcritas), sin mas reactivaciones, reportes autoservicio
Co-Authored-By: Claude Fable 5.1 <noreply@anthropic.com>
</commit_message>
<xml_diff>
--- a/recursos/comercial/plataforma LaHaus/RESPUESTA_JAIDER_2026-10-13.docx
+++ b/recursos/comercial/plataforma LaHaus/RESPUESTA_JAIDER_2026-10-13.docx
@@ -101,13 +101,13 @@
         <w:t>6. AUDIOS. Por favor agreguemos un paso OPCIONAL entre la forma de pago y la cita: "Última cosa, y es opcional: mándame un audio de 30 segundos contándome por qué quieres el inglés, en inglés o en español, como te salga. La asesora lo escucha antes de tu cita." El audio recibido marca el campo audio_recibido y suma en el criterio de disposición a la mentoría; la transcripción debe quedar en el panel para que la asesora la lea antes de llamar. Si el lead manda una imagen o un video, el agente responde: "Por aquí no puedo ver imágenes ni videos; cuéntame por escrito o en un audio y seguimos."</w:t>
         <w:br/>
         <w:br/>
-        <w:t>7. CADENCIA Y HORARIO (Ley 2300 de 2023). Primero la velocidad: el lead que escribe recibe respuesta del agente en segundos, a CUALQUIER hora, incluidos noches, domingos y festivos, y puede agendar ahí mismo (responder a quien nos escribe es información solicitada, no contacto comercial). El lead de FORMULARIO recibe primero la llamada y después el mensaje, dentro de los primeros 5 minutos, si entra en horario legal; si entra fuera de horario, recibe el mensaje de inmediato y, solo si no agenda con ese mensaje de WhatsApp, la llamada a primera hora del siguiente día hábil. Después de ese primer contacto, los siguientes respetan la ley: mensajes y llamadas por iniciativa nuestra solo de lunes a viernes 7:00 a.m.-7:00 p.m. y sábados 8:00 a.m.-3:00 p.m., nunca domingos ni festivos, y no más de un contacto al día. Pedimos: (a) apagar las llamadas de voz de la IA en frío (505 llamadas en el último informe dieron 2 citas y las 2 faltaron); (b) reintentos, plantillas y blasts solo en horario legal; (c) máximo 1 contacto por iniciativa nuestra al día por lead: día 0, día 1, día 3 y día 7 (despedida y silencio); (d) recordatorios de cita a las 6:30 p.m. del día anterior y 1 hora antes solo si cae en horario legal, y quitar la anticipación mínima de 24 h para agendar; (e) aviso inmediato a la asesora con cinco disparadores: pide una persona, segunda pregunta de precio o pregunta por la mensualidad, dice "no por ahora / lo pienso", es familia o ruta ejecutiva, o se queda callado 15 minutos después de dar el motivo sin agendar; (f) el primer contacto humano con el lead de WhatsApp será una "llamada anunciada" por la misma línea ("¿te llamo ahora 5 minutos? te marco desde el 3xx…"): ¿pueden habilitar llamadas de WhatsApp desde la línea de Heiiu? La cadencia completa la está revisando nuestro abogado; esto es lo que ya no admite discusión.</w:t>
+        <w:t>7. CADENCIA Y HORARIO (Ley 2300 de 2023). Primero la velocidad: el lead que escribe recibe respuesta del agente en segundos, a CUALQUIER hora, incluidos noches, domingos y festivos, y puede agendar ahí mismo (responder a quien nos escribe es información solicitada, no contacto comercial). El lead de FORMULARIO recibe primero la llamada y después el mensaje, dentro de los primeros 5 minutos, si entra en horario legal; si entra fuera de horario, recibe el mensaje de inmediato y, solo si no agenda con ese mensaje de WhatsApp, la llamada a primera hora del siguiente día hábil. Después de ese primer contacto, los siguientes respetan la ley: mensajes y llamadas por iniciativa nuestra solo de lunes a viernes 7:00 a.m.-7:00 p.m. y sábados 8:00 a.m.-3:00 p.m., nunca domingos ni festivos, y no más de un contacto al día. Pedimos: (a) apagar las llamadas de voz de la IA en frío (505 llamadas en el último informe dieron 2 citas y las 2 faltaron); (b) reintentos, plantillas y blasts solo en horario legal; (c) máximo 1 contacto por iniciativa nuestra al día por lead: día 0, día 1, día 3 y día 7 (despedida y silencio); (d) recordatorios de cita a las 6:30 p.m. del día anterior y 1 hora antes solo si cae en horario legal, y quitar la anticipación mínima de 24 h para agendar; (e) aviso inmediato a la asesora con cinco disparadores: pide una persona, segunda pregunta de precio o pregunta por la mensualidad, dice "no por ahora / lo pienso", es familia o ruta ejecutiva, o se queda callado 15 minutos después de dar el motivo sin agendar; (f) el primer contacto humano con el lead de WhatsApp será una "llamada anunciada" por la misma línea ("¿te llamo ahora 5 minutos? te marco desde el 3xx…"): esas llamadas deberían hacerse desde la plataforma, que las graba y las transcribe, para aprender de cada llamada: ¿se puede desde la línea de Heiiu? La cadencia completa la está revisando nuestro abogado.</w:t>
         <w:br/>
         <w:br/>
-        <w:t>8. REACTIVACIÓN (BLAST). El del 6 de octubre metió 489 leads y produjo 2 citas; un lead de pauta responde 4,2 veces más y agenda 3,7 veces más. Hasta nuevo aviso no se hacen reactivaciones sin aprobación por escrito de gerencia, y necesito que confirmen cómo se factura ese blast.</w:t>
+        <w:t>8. REACTIVACIÓN (BLAST). El del 6 de octubre metió 489 leads y produjo 2 citas; un lead de pauta responde 4,2 veces más y agenda 3,7 veces más. Hasta nuevo aviso no se hacen reactivaciones sin aprobación por escrito de gerencia, y necesito que confirmen cómo se factura ese blast. Por ahora no haremos más reactivaciones.</w:t>
         <w:br/>
         <w:br/>
-        <w:t>9. INFORME SEMANAL por etiqueta (caliente/tibio/frío) y por grupo A/B (último dígito del teléfono: par = solo bot, impar = bot + llamada anunciada): leads, citas, asistencia y matrícula (ese dato lo pasa la asesora). Y los envíos fallidos del primer mensaje a leads de pauta por código de error (131049, 131026) y por origen (formulario vs. clic a WhatsApp). Corte de evaluación: 31 de octubre.</w:t>
+        <w:t>9. INFORME SEMANAL por etiqueta (caliente/tibio/frío) y por grupo A/B (último dígito del teléfono: par = solo bot, impar = bot + llamada anunciada): leads, citas, asistencia y matrícula (ese dato lo pasa la asesora). Y los envíos fallidos del primer mensaje a leads de pauta por código de error (131049, 131026) y por origen (formulario vs. clic a WhatsApp). Corte de evaluación: 31 de octubre. Y una pregunta: ¿podemos sacar estos reportes nosotros mismos desde el panel (exportar o filtrar por etiqueta, grupo A/B, origen y fecha), para no tener que pedírselos cada mes?</w:t>
         <w:br/>
         <w:br/>
         <w:t>Lo demás (plantillas de nombre y correo, recordatorios a 12 h y 1 h, "fecha de cohorte") quedó bien. Lo que la plataforma no permite lo compensamos con la llamada anunciada de la asesora. Revisamos números el 15 con los anuncios nuevos al aire. Gracias.</w:t>

</xml_diff>